<commit_message>
Add Draft Docs (Roadmap and PRFAQ)
</commit_message>
<xml_diff>
--- a/CPFR_VDS_CPH_Docs/TPM/CPFR_VC_CPH_Roadmap_v0.3.1.docx
+++ b/CPFR_VDS_CPH_Docs/TPM/CPFR_VC_CPH_Roadmap_v0.3.1.docx
@@ -159,6 +159,9 @@
               <w:t>3</w:t>
             </w:r>
             <w:r>
+              <w:t>.1</w:t>
+            </w:r>
+            <w:r>
               <w:t xml:space="preserve"> — For Internal Review</w:t>
             </w:r>
           </w:p>
@@ -247,10 +250,7 @@
     </w:p>
     <w:p>
       <w:r>
-        <w:t xml:space="preserve">The current delivery model was designed when the program served approximately 1,000 vendors. At more than three times that scale, it creates compounding strain: distribution list management requires contractor triage before requests reach the CPFR team; data freshness is limited to weekly snapshots while ISMs and vendors need mid-week visibility; and Chewy remains the sole handler of vendor-to-recipient mapping, creating exposure to misdirected proprietary data—a risk that materialized in January 2026 when </w:t>
-      </w:r>
-      <w:r>
-        <w:t>data for one vendor was released to an unrelated vendor through the manual intake process.</w:t>
+        <w:t>The current delivery model was designed when the program served approximately 1,000 vendors. At more than three times that scale, it creates compounding strain: distribution list management requires contractor triage before requests reach the CPFR team; data freshness is limited to weekly snapshots while ISMs and vendors need mid-week visibility; and Chewy remains the sole handler of vendor-to-recipient mapping, creating exposure to misdirected proprietary data—a risk that materialized in January 2026 when data for one vendor was released to an unrelated vendor through the manual intake process.</w:t>
       </w:r>
     </w:p>
     <w:p>
@@ -346,6 +346,7 @@
       </w:r>
     </w:p>
     <w:p>
+      <w:commentRangeStart w:id="0"/>
       <w:r>
         <w:rPr>
           <w:b/>
@@ -361,6 +362,15 @@
       </w:r>
       <w:r>
         <w:t>portal development proceeds.</w:t>
+      </w:r>
+      <w:commentRangeEnd w:id="0"/>
+      <w:r>
+        <w:rPr>
+          <w:rStyle w:val="CommentReference"/>
+          <w:sz w:val="20"/>
+          <w:szCs w:val="22"/>
+        </w:rPr>
+        <w:commentReference w:id="0"/>
       </w:r>
     </w:p>
     <w:p>
@@ -993,14 +1003,7 @@
           <w:i/>
           <w:iCs/>
         </w:rPr>
-        <w:t>Additional risk exposure in the current state includes documented cost avoidance from threshold mismatch events (estimated at $5M single-event, ~$15M annual exposure based on ISM-reported incidents from recurring supply chain events), active data leakage vulnerability in manual distribution processes, and cross-system discrepancy triage events consuming 4–6 people across teams for 1–2 days per incident. These figures are based on real events reported by ISMs; detailed incident documentation is being compile</w:t>
-      </w:r>
-      <w:r>
-        <w:rPr>
-          <w:i/>
-          <w:iCs/>
-        </w:rPr>
-        <w:t>d.</w:t>
+        <w:t>Additional risk exposure in the current state includes documented cost avoidance from threshold mismatch events (estimated at $5M single-event, ~$15M annual exposure based on ISM-reported incidents from recurring supply chain events), active data leakage vulnerability in manual distribution processes, and cross-system discrepancy triage events consuming 4–6 people across teams for 1–2 days per incident. These figures are based on real events reported by ISMs; detailed incident documentation is being compiled.</w:t>
       </w:r>
     </w:p>
     <w:p>
@@ -1091,10 +1094,7 @@
         <w:pStyle w:val="ListBullet"/>
       </w:pPr>
       <w:r>
-        <w:t xml:space="preserve">CPFR Data Platform: Delivering </w:t>
-      </w:r>
-      <w:r>
-        <w:t>2026</w:t>
+        <w:t>CPFR Data Platform: Delivering 2026</w:t>
       </w:r>
       <w:r>
         <w:t>-03-31</w:t>
@@ -1615,6 +1615,7 @@
               <w:pStyle w:val="BodyText"/>
               <w:spacing w:after="0"/>
             </w:pPr>
+            <w:commentRangeStart w:id="1"/>
             <w:r>
               <w:t>Produce LOE estimates and resource ask</w:t>
             </w:r>
@@ -1669,6 +1670,15 @@
             </w:pPr>
             <w:r>
               <w:t>Requires scoping sessions complete. Target: ~1 month from CPH engagement.</w:t>
+            </w:r>
+            <w:commentRangeEnd w:id="1"/>
+            <w:r>
+              <w:rPr>
+                <w:rStyle w:val="CommentReference"/>
+                <w:sz w:val="20"/>
+                <w:szCs w:val="22"/>
+              </w:rPr>
+              <w:commentReference w:id="1"/>
             </w:r>
           </w:p>
         </w:tc>
@@ -5347,34 +5357,12 @@
           <w:sz w:val="18"/>
           <w:szCs w:val="18"/>
         </w:rPr>
-        <w:t xml:space="preserve">hargebacks integrated throughout. Entitlement figures corrected. Timelines made </w:t>
-      </w:r>
-      <w:proofErr w:type="gramStart"/>
-      <w:r>
-        <w:rPr>
-          <w:i/>
-          <w:iCs/>
-          <w:color w:val="666666"/>
-          <w:sz w:val="18"/>
-          <w:szCs w:val="18"/>
-        </w:rPr>
-        <w:t>dependency-driven</w:t>
-      </w:r>
-      <w:proofErr w:type="gramEnd"/>
-      <w:r>
-        <w:rPr>
-          <w:i/>
-          <w:iCs/>
-          <w:color w:val="666666"/>
-          <w:sz w:val="18"/>
-          <w:szCs w:val="18"/>
-        </w:rPr>
-        <w:t>.</w:t>
+        <w:t>hargebacks integrated throughout. Entitlement figures corrected. Timelines made dependency-driven.</w:t>
       </w:r>
     </w:p>
     <w:sectPr>
-      <w:headerReference w:type="default" r:id="rId7"/>
-      <w:footerReference w:type="default" r:id="rId8"/>
+      <w:headerReference w:type="default" r:id="rId11"/>
+      <w:footerReference w:type="default" r:id="rId12"/>
       <w:pgSz w:w="12240" w:h="15840"/>
       <w:pgMar w:top="720" w:right="720" w:bottom="720" w:left="720" w:header="288" w:footer="288" w:gutter="288"/>
       <w:lnNumType w:countBy="1" w:restart="continuous"/>
@@ -5383,6 +5371,64 @@
     </w:sectPr>
   </w:body>
 </w:document>
+</file>
+
+<file path=word/comments.xml><?xml version="1.0" encoding="utf-8"?>
+<w:comments xmlns:wpc="http://schemas.microsoft.com/office/word/2010/wordprocessingCanvas" xmlns:cx="http://schemas.microsoft.com/office/drawing/2014/chartex" xmlns:cx1="http://schemas.microsoft.com/office/drawing/2015/9/8/chartex" xmlns:cx2="http://schemas.microsoft.com/office/drawing/2015/10/21/chartex" xmlns:cx3="http://schemas.microsoft.com/office/drawing/2016/5/9/chartex" xmlns:cx4="http://schemas.microsoft.com/office/drawing/2016/5/10/chartex" xmlns:cx5="http://schemas.microsoft.com/office/drawing/2016/5/11/chartex" xmlns:cx6="http://schemas.microsoft.com/office/drawing/2016/5/12/chartex" xmlns:cx7="http://schemas.microsoft.com/office/drawing/2016/5/13/chartex" xmlns:cx8="http://schemas.microsoft.com/office/drawing/2016/5/14/chartex" xmlns:mc="http://schemas.openxmlformats.org/markup-compatibility/2006" xmlns:aink="http://schemas.microsoft.com/office/drawing/2016/ink" xmlns:am3d="http://schemas.microsoft.com/office/drawing/2017/model3d" xmlns:o="urn:schemas-microsoft-com:office:office" xmlns:oel="http://schemas.microsoft.com/office/2019/extlst" xmlns:r="http://schemas.openxmlformats.org/officeDocument/2006/relationships" xmlns:m="http://schemas.openxmlformats.org/officeDocument/2006/math" xmlns:v="urn:schemas-microsoft-com:vml" xmlns:wp14="http://schemas.microsoft.com/office/word/2010/wordprocessingDrawing" xmlns:wp="http://schemas.openxmlformats.org/drawingml/2006/wordprocessingDrawing" xmlns:w10="urn:schemas-microsoft-com:office:word" xmlns:w="http://schemas.openxmlformats.org/wordprocessingml/2006/main" xmlns:w14="http://schemas.microsoft.com/office/word/2010/wordml" xmlns:w15="http://schemas.microsoft.com/office/word/2012/wordml" xmlns:w16cex="http://schemas.microsoft.com/office/word/2018/wordml/cex" xmlns:w16cid="http://schemas.microsoft.com/office/word/2016/wordml/cid" xmlns:w16="http://schemas.microsoft.com/office/word/2018/wordml" xmlns:w16du="http://schemas.microsoft.com/office/word/2023/wordml/word16du" xmlns:w16sdtdh="http://schemas.microsoft.com/office/word/2020/wordml/sdtdatahash" xmlns:w16sdtfl="http://schemas.microsoft.com/office/word/2024/wordml/sdtformatlock" xmlns:w16se="http://schemas.microsoft.com/office/word/2015/wordml/symex" xmlns:wpg="http://schemas.microsoft.com/office/word/2010/wordprocessingGroup" xmlns:wpi="http://schemas.microsoft.com/office/word/2010/wordprocessingInk" xmlns:wne="http://schemas.microsoft.com/office/word/2006/wordml" xmlns:wps="http://schemas.microsoft.com/office/word/2010/wordprocessingShape" mc:Ignorable="w14 w15 w16se w16cid w16 w16cex w16sdtdh w16sdtfl w16du wp14">
+  <w:comment w:id="0" w:author="Nathan Miles" w:date="2026-03-16T11:13:00Z" w:initials="NM">
+    <w:p>
+      <w:r>
+        <w:rPr>
+          <w:rStyle w:val="CommentReference"/>
+        </w:rPr>
+        <w:annotationRef/>
+      </w:r>
+      <w:r>
+        <w:rPr>
+          <w:szCs w:val="20"/>
+        </w:rPr>
+        <w:t>Add mention of Steven's ongoing work, and ISM integrations. Primer, but not explication</w:t>
+      </w:r>
+    </w:p>
+  </w:comment>
+  <w:comment w:id="1" w:author="Nathan Miles" w:date="2026-03-16T11:14:00Z" w:initials="NM">
+    <w:p>
+      <w:r>
+        <w:rPr>
+          <w:rStyle w:val="CommentReference"/>
+        </w:rPr>
+        <w:annotationRef/>
+      </w:r>
+      <w:r>
+        <w:rPr>
+          <w:szCs w:val="20"/>
+        </w:rPr>
+        <w:t>Remove the internal activities (i.e. what CPFR/VC needs to do internally). Focus this on what has been shared, and what is needed going forward. Include BRD, User Stories, etc.</w:t>
+      </w:r>
+    </w:p>
+  </w:comment>
+</w:comments>
+</file>
+
+<file path=word/commentsExtended.xml><?xml version="1.0" encoding="utf-8"?>
+<w15:commentsEx xmlns:wpc="http://schemas.microsoft.com/office/word/2010/wordprocessingCanvas" xmlns:cx="http://schemas.microsoft.com/office/drawing/2014/chartex" xmlns:cx1="http://schemas.microsoft.com/office/drawing/2015/9/8/chartex" xmlns:cx2="http://schemas.microsoft.com/office/drawing/2015/10/21/chartex" xmlns:cx3="http://schemas.microsoft.com/office/drawing/2016/5/9/chartex" xmlns:cx4="http://schemas.microsoft.com/office/drawing/2016/5/10/chartex" xmlns:cx5="http://schemas.microsoft.com/office/drawing/2016/5/11/chartex" xmlns:cx6="http://schemas.microsoft.com/office/drawing/2016/5/12/chartex" xmlns:cx7="http://schemas.microsoft.com/office/drawing/2016/5/13/chartex" xmlns:cx8="http://schemas.microsoft.com/office/drawing/2016/5/14/chartex" xmlns:mc="http://schemas.openxmlformats.org/markup-compatibility/2006" xmlns:aink="http://schemas.microsoft.com/office/drawing/2016/ink" xmlns:am3d="http://schemas.microsoft.com/office/drawing/2017/model3d" xmlns:o="urn:schemas-microsoft-com:office:office" xmlns:oel="http://schemas.microsoft.com/office/2019/extlst" xmlns:r="http://schemas.openxmlformats.org/officeDocument/2006/relationships" xmlns:m="http://schemas.openxmlformats.org/officeDocument/2006/math" xmlns:v="urn:schemas-microsoft-com:vml" xmlns:wp14="http://schemas.microsoft.com/office/word/2010/wordprocessingDrawing" xmlns:wp="http://schemas.openxmlformats.org/drawingml/2006/wordprocessingDrawing" xmlns:w10="urn:schemas-microsoft-com:office:word" xmlns:w="http://schemas.openxmlformats.org/wordprocessingml/2006/main" xmlns:w14="http://schemas.microsoft.com/office/word/2010/wordml" xmlns:w15="http://schemas.microsoft.com/office/word/2012/wordml" xmlns:w16cex="http://schemas.microsoft.com/office/word/2018/wordml/cex" xmlns:w16cid="http://schemas.microsoft.com/office/word/2016/wordml/cid" xmlns:w16="http://schemas.microsoft.com/office/word/2018/wordml" xmlns:w16du="http://schemas.microsoft.com/office/word/2023/wordml/word16du" xmlns:w16sdtdh="http://schemas.microsoft.com/office/word/2020/wordml/sdtdatahash" xmlns:w16sdtfl="http://schemas.microsoft.com/office/word/2024/wordml/sdtformatlock" xmlns:w16se="http://schemas.microsoft.com/office/word/2015/wordml/symex" xmlns:wpg="http://schemas.microsoft.com/office/word/2010/wordprocessingGroup" xmlns:wpi="http://schemas.microsoft.com/office/word/2010/wordprocessingInk" xmlns:wne="http://schemas.microsoft.com/office/word/2006/wordml" xmlns:wps="http://schemas.microsoft.com/office/word/2010/wordprocessingShape" mc:Ignorable="w14 w15 w16se w16cid w16 w16cex w16sdtdh w16sdtfl w16du wp14">
+  <w15:commentEx w15:paraId="4B073D28" w15:done="0"/>
+  <w15:commentEx w15:paraId="21ADE1E5" w15:done="0"/>
+</w15:commentsEx>
+</file>
+
+<file path=word/commentsExtensible.xml><?xml version="1.0" encoding="utf-8"?>
+<w16cex:commentsExtensible xmlns:wpc="http://schemas.microsoft.com/office/word/2010/wordprocessingCanvas" xmlns:cx="http://schemas.microsoft.com/office/drawing/2014/chartex" xmlns:cx1="http://schemas.microsoft.com/office/drawing/2015/9/8/chartex" xmlns:cx2="http://schemas.microsoft.com/office/drawing/2015/10/21/chartex" xmlns:cx3="http://schemas.microsoft.com/office/drawing/2016/5/9/chartex" xmlns:cx4="http://schemas.microsoft.com/office/drawing/2016/5/10/chartex" xmlns:cx5="http://schemas.microsoft.com/office/drawing/2016/5/11/chartex" xmlns:cx6="http://schemas.microsoft.com/office/drawing/2016/5/12/chartex" xmlns:cx7="http://schemas.microsoft.com/office/drawing/2016/5/13/chartex" xmlns:cx8="http://schemas.microsoft.com/office/drawing/2016/5/14/chartex" xmlns:cr="http://schemas.microsoft.com/office/comments/2020/reactions" xmlns:mc="http://schemas.openxmlformats.org/markup-compatibility/2006" xmlns:aink="http://schemas.microsoft.com/office/drawing/2016/ink" xmlns:am3d="http://schemas.microsoft.com/office/drawing/2017/model3d" xmlns:o="urn:schemas-microsoft-com:office:office" xmlns:oel="http://schemas.microsoft.com/office/2019/extlst" xmlns:r="http://schemas.openxmlformats.org/officeDocument/2006/relationships" xmlns:m="http://schemas.openxmlformats.org/officeDocument/2006/math" xmlns:v="urn:schemas-microsoft-com:vml" xmlns:wp14="http://schemas.microsoft.com/office/word/2010/wordprocessingDrawing" xmlns:wp="http://schemas.openxmlformats.org/drawingml/2006/wordprocessingDrawing" xmlns:w10="urn:schemas-microsoft-com:office:word" xmlns:w="http://schemas.openxmlformats.org/wordprocessingml/2006/main" xmlns:w14="http://schemas.microsoft.com/office/word/2010/wordml" xmlns:w15="http://schemas.microsoft.com/office/word/2012/wordml" xmlns:w16cex="http://schemas.microsoft.com/office/word/2018/wordml/cex" xmlns:w16cid="http://schemas.microsoft.com/office/word/2016/wordml/cid" xmlns:w16="http://schemas.microsoft.com/office/word/2018/wordml" xmlns:w16du="http://schemas.microsoft.com/office/word/2023/wordml/word16du" xmlns:w16sdtdh="http://schemas.microsoft.com/office/word/2020/wordml/sdtdatahash" xmlns:w16sdtfl="http://schemas.microsoft.com/office/word/2024/wordml/sdtformatlock" xmlns:w16se="http://schemas.microsoft.com/office/word/2015/wordml/symex" xmlns:wpg="http://schemas.microsoft.com/office/word/2010/wordprocessingGroup" xmlns:wpi="http://schemas.microsoft.com/office/word/2010/wordprocessingInk" xmlns:wne="http://schemas.microsoft.com/office/word/2006/wordml" xmlns:wps="http://schemas.microsoft.com/office/word/2010/wordprocessingShape" mc:Ignorable="w14 w15 w16se w16cid w16 w16cex w16sdtdh w16sdtfl cr w16du wp14">
+  <w16cex:commentExtensible w16cex:durableId="08BD7163" w16cex:dateUtc="2026-03-16T18:13:00Z"/>
+  <w16cex:commentExtensible w16cex:durableId="65BEEB09" w16cex:dateUtc="2026-03-16T18:14:00Z"/>
+</w16cex:commentsExtensible>
+</file>
+
+<file path=word/commentsIds.xml><?xml version="1.0" encoding="utf-8"?>
+<w16cid:commentsIds xmlns:wpc="http://schemas.microsoft.com/office/word/2010/wordprocessingCanvas" xmlns:cx="http://schemas.microsoft.com/office/drawing/2014/chartex" xmlns:cx1="http://schemas.microsoft.com/office/drawing/2015/9/8/chartex" xmlns:cx2="http://schemas.microsoft.com/office/drawing/2015/10/21/chartex" xmlns:cx3="http://schemas.microsoft.com/office/drawing/2016/5/9/chartex" xmlns:cx4="http://schemas.microsoft.com/office/drawing/2016/5/10/chartex" xmlns:cx5="http://schemas.microsoft.com/office/drawing/2016/5/11/chartex" xmlns:cx6="http://schemas.microsoft.com/office/drawing/2016/5/12/chartex" xmlns:cx7="http://schemas.microsoft.com/office/drawing/2016/5/13/chartex" xmlns:cx8="http://schemas.microsoft.com/office/drawing/2016/5/14/chartex" xmlns:mc="http://schemas.openxmlformats.org/markup-compatibility/2006" xmlns:aink="http://schemas.microsoft.com/office/drawing/2016/ink" xmlns:am3d="http://schemas.microsoft.com/office/drawing/2017/model3d" xmlns:o="urn:schemas-microsoft-com:office:office" xmlns:oel="http://schemas.microsoft.com/office/2019/extlst" xmlns:r="http://schemas.openxmlformats.org/officeDocument/2006/relationships" xmlns:m="http://schemas.openxmlformats.org/officeDocument/2006/math" xmlns:v="urn:schemas-microsoft-com:vml" xmlns:wp14="http://schemas.microsoft.com/office/word/2010/wordprocessingDrawing" xmlns:wp="http://schemas.openxmlformats.org/drawingml/2006/wordprocessingDrawing" xmlns:w10="urn:schemas-microsoft-com:office:word" xmlns:w="http://schemas.openxmlformats.org/wordprocessingml/2006/main" xmlns:w14="http://schemas.microsoft.com/office/word/2010/wordml" xmlns:w15="http://schemas.microsoft.com/office/word/2012/wordml" xmlns:w16cex="http://schemas.microsoft.com/office/word/2018/wordml/cex" xmlns:w16cid="http://schemas.microsoft.com/office/word/2016/wordml/cid" xmlns:w16="http://schemas.microsoft.com/office/word/2018/wordml" xmlns:w16du="http://schemas.microsoft.com/office/word/2023/wordml/word16du" xmlns:w16sdtdh="http://schemas.microsoft.com/office/word/2020/wordml/sdtdatahash" xmlns:w16sdtfl="http://schemas.microsoft.com/office/word/2024/wordml/sdtformatlock" xmlns:w16se="http://schemas.microsoft.com/office/word/2015/wordml/symex" xmlns:wpg="http://schemas.microsoft.com/office/word/2010/wordprocessingGroup" xmlns:wpi="http://schemas.microsoft.com/office/word/2010/wordprocessingInk" xmlns:wne="http://schemas.microsoft.com/office/word/2006/wordml" xmlns:wps="http://schemas.microsoft.com/office/word/2010/wordprocessingShape" mc:Ignorable="w14 w15 w16se w16cid w16 w16cex w16sdtdh w16sdtfl w16du wp14">
+  <w16cid:commentId w16cid:paraId="4B073D28" w16cid:durableId="08BD7163"/>
+  <w16cid:commentId w16cid:paraId="21ADE1E5" w16cid:durableId="65BEEB09"/>
+</w16cid:commentsIds>
 </file>
 
 <file path=word/endnotes.xml><?xml version="1.0" encoding="utf-8"?>
@@ -5518,7 +5564,17 @@
         <w:sz w:val="18"/>
         <w:szCs w:val="18"/>
       </w:rPr>
-      <w:t>Roadmap—Draft v0.2</w:t>
+      <w:t>Roadmap—Draft v0.</w:t>
+    </w:r>
+    <w:r>
+      <w:rPr>
+        <w:i/>
+        <w:iCs/>
+        <w:color w:val="7F7F7F" w:themeColor="text1" w:themeTint="80"/>
+        <w:sz w:val="18"/>
+        <w:szCs w:val="18"/>
+      </w:rPr>
+      <w:t>3.1</w:t>
     </w:r>
     <w:r>
       <w:rPr>
@@ -5996,6 +6052,14 @@
     <w:abstractNumId w:val="0"/>
   </w:num>
 </w:numbering>
+</file>
+
+<file path=word/people.xml><?xml version="1.0" encoding="utf-8"?>
+<w15:people xmlns:wpc="http://schemas.microsoft.com/office/word/2010/wordprocessingCanvas" xmlns:cx="http://schemas.microsoft.com/office/drawing/2014/chartex" xmlns:cx1="http://schemas.microsoft.com/office/drawing/2015/9/8/chartex" xmlns:cx2="http://schemas.microsoft.com/office/drawing/2015/10/21/chartex" xmlns:cx3="http://schemas.microsoft.com/office/drawing/2016/5/9/chartex" xmlns:cx4="http://schemas.microsoft.com/office/drawing/2016/5/10/chartex" xmlns:cx5="http://schemas.microsoft.com/office/drawing/2016/5/11/chartex" xmlns:cx6="http://schemas.microsoft.com/office/drawing/2016/5/12/chartex" xmlns:cx7="http://schemas.microsoft.com/office/drawing/2016/5/13/chartex" xmlns:cx8="http://schemas.microsoft.com/office/drawing/2016/5/14/chartex" xmlns:mc="http://schemas.openxmlformats.org/markup-compatibility/2006" xmlns:aink="http://schemas.microsoft.com/office/drawing/2016/ink" xmlns:am3d="http://schemas.microsoft.com/office/drawing/2017/model3d" xmlns:o="urn:schemas-microsoft-com:office:office" xmlns:oel="http://schemas.microsoft.com/office/2019/extlst" xmlns:r="http://schemas.openxmlformats.org/officeDocument/2006/relationships" xmlns:m="http://schemas.openxmlformats.org/officeDocument/2006/math" xmlns:v="urn:schemas-microsoft-com:vml" xmlns:wp14="http://schemas.microsoft.com/office/word/2010/wordprocessingDrawing" xmlns:wp="http://schemas.openxmlformats.org/drawingml/2006/wordprocessingDrawing" xmlns:w10="urn:schemas-microsoft-com:office:word" xmlns:w="http://schemas.openxmlformats.org/wordprocessingml/2006/main" xmlns:w14="http://schemas.microsoft.com/office/word/2010/wordml" xmlns:w15="http://schemas.microsoft.com/office/word/2012/wordml" xmlns:w16cex="http://schemas.microsoft.com/office/word/2018/wordml/cex" xmlns:w16cid="http://schemas.microsoft.com/office/word/2016/wordml/cid" xmlns:w16="http://schemas.microsoft.com/office/word/2018/wordml" xmlns:w16du="http://schemas.microsoft.com/office/word/2023/wordml/word16du" xmlns:w16sdtdh="http://schemas.microsoft.com/office/word/2020/wordml/sdtdatahash" xmlns:w16sdtfl="http://schemas.microsoft.com/office/word/2024/wordml/sdtformatlock" xmlns:w16se="http://schemas.microsoft.com/office/word/2015/wordml/symex" xmlns:wpg="http://schemas.microsoft.com/office/word/2010/wordprocessingGroup" xmlns:wpi="http://schemas.microsoft.com/office/word/2010/wordprocessingInk" xmlns:wne="http://schemas.microsoft.com/office/word/2006/wordml" xmlns:wps="http://schemas.microsoft.com/office/word/2010/wordprocessingShape" mc:Ignorable="w14 w15 w16se w16cid w16 w16cex w16sdtdh w16sdtfl w16du wp14">
+  <w15:person w15:author="Nathan Miles">
+    <w15:presenceInfo w15:providerId="AD" w15:userId="S::nmiles1@chewy.com::feb1e035-60a1-474f-bb67-372cd6733068"/>
+  </w15:person>
+</w15:people>
 </file>
 
 <file path=word/styles.xml><?xml version="1.0" encoding="utf-8"?>
@@ -6732,6 +6796,75 @@
       <w:sz w:val="18"/>
     </w:rPr>
   </w:style>
+  <w:style w:type="character" w:styleId="CommentReference">
+    <w:name w:val="annotation reference"/>
+    <w:basedOn w:val="DefaultParagraphFont"/>
+    <w:uiPriority w:val="99"/>
+    <w:semiHidden/>
+    <w:unhideWhenUsed/>
+    <w:rsid w:val="00D359F3"/>
+    <w:rPr>
+      <w:sz w:val="16"/>
+      <w:szCs w:val="16"/>
+    </w:rPr>
+  </w:style>
+  <w:style w:type="paragraph" w:styleId="CommentText">
+    <w:name w:val="annotation text"/>
+    <w:basedOn w:val="Normal"/>
+    <w:link w:val="CommentTextChar"/>
+    <w:uiPriority w:val="99"/>
+    <w:semiHidden/>
+    <w:unhideWhenUsed/>
+    <w:rsid w:val="00D359F3"/>
+    <w:pPr>
+      <w:spacing w:line="240" w:lineRule="auto"/>
+    </w:pPr>
+    <w:rPr>
+      <w:szCs w:val="20"/>
+    </w:rPr>
+  </w:style>
+  <w:style w:type="character" w:customStyle="1" w:styleId="CommentTextChar">
+    <w:name w:val="Comment Text Char"/>
+    <w:basedOn w:val="DefaultParagraphFont"/>
+    <w:link w:val="CommentText"/>
+    <w:uiPriority w:val="99"/>
+    <w:semiHidden/>
+    <w:rsid w:val="00D359F3"/>
+    <w:rPr>
+      <w:rFonts w:asciiTheme="minorHAnsi" w:hAnsiTheme="minorHAnsi"/>
+      <w:sz w:val="20"/>
+      <w:szCs w:val="20"/>
+    </w:rPr>
+  </w:style>
+  <w:style w:type="paragraph" w:styleId="CommentSubject">
+    <w:name w:val="annotation subject"/>
+    <w:basedOn w:val="CommentText"/>
+    <w:next w:val="CommentText"/>
+    <w:link w:val="CommentSubjectChar"/>
+    <w:uiPriority w:val="99"/>
+    <w:semiHidden/>
+    <w:unhideWhenUsed/>
+    <w:rsid w:val="00D359F3"/>
+    <w:rPr>
+      <w:b/>
+      <w:bCs/>
+    </w:rPr>
+  </w:style>
+  <w:style w:type="character" w:customStyle="1" w:styleId="CommentSubjectChar">
+    <w:name w:val="Comment Subject Char"/>
+    <w:basedOn w:val="CommentTextChar"/>
+    <w:link w:val="CommentSubject"/>
+    <w:uiPriority w:val="99"/>
+    <w:semiHidden/>
+    <w:rsid w:val="00D359F3"/>
+    <w:rPr>
+      <w:rFonts w:asciiTheme="minorHAnsi" w:hAnsiTheme="minorHAnsi"/>
+      <w:b/>
+      <w:bCs/>
+      <w:sz w:val="20"/>
+      <w:szCs w:val="20"/>
+    </w:rPr>
+  </w:style>
 </w:styles>
 </file>
 

</xml_diff>